<commit_message>
Atualiza documentação do laboratório
</commit_message>
<xml_diff>
--- a/Documentação/A4 Lab. Desenv. Web - FAC.docx
+++ b/Documentação/A4 Lab. Desenv. Web - FAC.docx
@@ -3895,7 +3895,7 @@
               <w:rPr>
                 <w:rFonts w:cs="Arial"/>
               </w:rPr>
-              <w:t>Familiar / Sistema</w:t>
+              <w:t>Familiar</w:t>
             </w:r>
           </w:p>
         </w:tc>
@@ -5364,7 +5364,7 @@
           <w:noProof/>
         </w:rPr>
         <w:pict w14:anchorId="5A1BC969">
-          <v:rect id="_x0000_s1025" alt="" style="position:absolute;left:0;text-align:left;margin-left:0;margin-top:0;width:595.3pt;height:841.9pt;z-index:251659264;mso-wrap-edited:f;mso-width-percent:1000;mso-height-percent:1000;mso-position-horizontal-relative:page;mso-position-vertical-relative:page;mso-width-percent:1000;mso-height-percent:1000;mso-width-relative:page;mso-height-relative:page" o:bwmode="white" filled="f" stroked="f" strokeweight="0">
+          <v:rect id="_x0000_s1025" alt="" style="position:absolute;left:0;text-align:left;margin-left:0;margin-top:0;width:595.3pt;height:841.9pt;z-index:251658240;mso-wrap-edited:f;mso-width-percent:1000;mso-height-percent:1000;mso-position-horizontal-relative:page;mso-position-vertical-relative:page;mso-width-percent:1000;mso-height-percent:1000;mso-width-relative:page;mso-height-relative:page" o:bwmode="white" filled="f" stroked="f" strokeweight="0">
             <w10:wrap anchorx="margin" anchory="margin"/>
           </v:rect>
         </w:pict>
@@ -6192,6 +6192,7 @@
   <w:style w:type="character" w:default="1" w:styleId="Fontepargpadro">
     <w:name w:val="Default Paragraph Font"/>
     <w:uiPriority w:val="1"/>
+    <w:semiHidden/>
     <w:unhideWhenUsed/>
   </w:style>
   <w:style w:type="table" w:default="1" w:styleId="Tabelanormal">

</xml_diff>

<commit_message>
v1 diagramas de atividade
</commit_message>
<xml_diff>
--- a/Documentação/A4 Lab. Desenv. Web - FAC.docx
+++ b/Documentação/A4 Lab. Desenv. Web - FAC.docx
@@ -177,7 +177,7 @@
         <w:pStyle w:val="NomedoAutor"/>
       </w:pPr>
       <w:r>
-        <w:t>Ángelica Lima</w:t>
+        <w:t>Angélica Lima Soares de Oliveira</w:t>
       </w:r>
     </w:p>
     <w:p>
@@ -193,7 +193,13 @@
         <w:pStyle w:val="NomedoAutor"/>
       </w:pPr>
       <w:r>
-        <w:t>Camile Monteiro</w:t>
+        <w:t>Camile Pimenta Monteiro</w:t>
+      </w:r>
+      <w:r>
+        <w:br/>
+      </w:r>
+      <w:r>
+        <w:t>Davi Matos dos Santos</w:t>
       </w:r>
     </w:p>
     <w:p>
@@ -201,7 +207,7 @@
         <w:pStyle w:val="NomedoAutor"/>
       </w:pPr>
       <w:r>
-        <w:t>Davi Matos dos Santos</w:t>
+        <w:t>Felipe Gabriel Ferraz dos Santos</w:t>
       </w:r>
     </w:p>
     <w:p>
@@ -209,7 +215,13 @@
         <w:pStyle w:val="NomedoAutor"/>
       </w:pPr>
       <w:r>
-        <w:t>Felipe Gabriel Ferraz dos Santos</w:t>
+        <w:t>Jo</w:t>
+      </w:r>
+      <w:r>
+        <w:t>ã</w:t>
+      </w:r>
+      <w:r>
+        <w:t>o Lucas Tavares dos Santos</w:t>
       </w:r>
     </w:p>
     <w:p>
@@ -217,13 +229,7 @@
         <w:pStyle w:val="NomedoAutor"/>
       </w:pPr>
       <w:r>
-        <w:t>Jo</w:t>
-      </w:r>
-      <w:r>
-        <w:t>ã</w:t>
-      </w:r>
-      <w:r>
-        <w:t>o Lucas Tavares dos Santos</w:t>
+        <w:t>Kamille Monteiro</w:t>
       </w:r>
     </w:p>
     <w:p>
@@ -231,7 +237,7 @@
         <w:pStyle w:val="NomedoAutor"/>
       </w:pPr>
       <w:r>
-        <w:t>Kamille Monteiro</w:t>
+        <w:t>lUCAS RATS ferreira</w:t>
       </w:r>
     </w:p>
     <w:p>
@@ -239,7 +245,7 @@
         <w:pStyle w:val="NomedoAutor"/>
       </w:pPr>
       <w:r>
-        <w:t>lUCAS RATS ferreira</w:t>
+        <w:t>Letícia dos reis prado</w:t>
       </w:r>
     </w:p>
     <w:p>
@@ -247,14 +253,6 @@
         <w:pStyle w:val="NomedoAutor"/>
       </w:pPr>
       <w:r>
-        <w:t>Letícia dos reis prado</w:t>
-      </w:r>
-    </w:p>
-    <w:p>
-      <w:pPr>
-        <w:pStyle w:val="NomedoAutor"/>
-      </w:pPr>
-      <w:r>
         <w:t>Ricardo dos Santos Dias</w:t>
       </w:r>
     </w:p>
@@ -309,12 +307,14 @@
           <w:sz w:val="28"/>
         </w:rPr>
       </w:pPr>
+      <w:proofErr w:type="spellStart"/>
       <w:r>
         <w:rPr>
           <w:sz w:val="28"/>
         </w:rPr>
         <w:t>Fac</w:t>
       </w:r>
+      <w:proofErr w:type="spellEnd"/>
     </w:p>
     <w:p>
       <w:pPr>
@@ -439,7 +439,7 @@
           <w:rFonts w:cs="Arial"/>
           <w:caps/>
         </w:rPr>
-        <w:t>ÁNGELICA LIMA</w:t>
+        <w:t>Angélica Lima Soares de Oliveira</w:t>
       </w:r>
     </w:p>
     <w:p>
@@ -473,7 +473,7 @@
           <w:rFonts w:cs="Arial"/>
           <w:caps/>
         </w:rPr>
-        <w:t>CAMILE MONTEIRO</w:t>
+        <w:t>Camile Pimenta Monteiro</w:t>
       </w:r>
     </w:p>
     <w:p>
@@ -637,12 +637,14 @@
           <w:sz w:val="28"/>
         </w:rPr>
       </w:pPr>
+      <w:proofErr w:type="spellStart"/>
       <w:r>
         <w:rPr>
           <w:sz w:val="28"/>
         </w:rPr>
         <w:t>Fac</w:t>
       </w:r>
+      <w:proofErr w:type="spellEnd"/>
     </w:p>
     <w:p>
       <w:pPr>
@@ -768,8 +770,13 @@
       <w:pPr>
         <w:pStyle w:val="NomedoOrientador"/>
       </w:pPr>
-      <w:r>
-        <w:t xml:space="preserve">Co-orientador: </w:t>
+      <w:proofErr w:type="spellStart"/>
+      <w:r>
+        <w:t>Co-orientador</w:t>
+      </w:r>
+      <w:proofErr w:type="spellEnd"/>
+      <w:r>
+        <w:t xml:space="preserve">: </w:t>
       </w:r>
       <w:r>
         <w:rPr>
@@ -787,8 +794,16 @@
         <w:rPr>
           <w:color w:val="FF0000"/>
         </w:rPr>
-        <w:t xml:space="preserve"> do co-orientador</w:t>
-      </w:r>
+        <w:t xml:space="preserve"> do </w:t>
+      </w:r>
+      <w:proofErr w:type="spellStart"/>
+      <w:r>
+        <w:rPr>
+          <w:color w:val="FF0000"/>
+        </w:rPr>
+        <w:t>co-orientador</w:t>
+      </w:r>
+      <w:proofErr w:type="spellEnd"/>
       <w:r>
         <w:rPr>
           <w:color w:val="FF0000"/>
@@ -1085,94 +1100,122 @@
     </w:p>
     <w:p>
       <w:pPr>
-        <w:ind w:firstLine="0"/>
-        <w:rPr>
-          <w:rFonts w:cs="Arial"/>
-          <w:color w:val="0000FF"/>
-        </w:rPr>
-      </w:pPr>
-      <w:r>
-        <w:rPr>
-          <w:rFonts w:cs="Arial"/>
-          <w:bCs/>
-          <w:color w:val="0000FF"/>
-        </w:rPr>
-        <w:t>Relação de cada ilustração</w:t>
-      </w:r>
-      <w:r>
-        <w:rPr>
-          <w:rFonts w:cs="Arial"/>
-          <w:bCs/>
-          <w:color w:val="0000FF"/>
-        </w:rPr>
-        <w:t>/imagem/foto</w:t>
-      </w:r>
-      <w:r>
-        <w:rPr>
-          <w:rFonts w:cs="Arial"/>
-          <w:bCs/>
-          <w:color w:val="0000FF"/>
-        </w:rPr>
-        <w:t xml:space="preserve"> de acordo com a ordem apresentada no texto, devendo incluir</w:t>
-      </w:r>
-      <w:r>
-        <w:rPr>
-          <w:rFonts w:cs="Arial"/>
-          <w:color w:val="0000FF"/>
-        </w:rPr>
-        <w:t>: palavra designativa, acompanhada do número de ocorrência no texto (em algarismos arábicos) e seu título</w:t>
-      </w:r>
-      <w:r>
-        <w:rPr>
-          <w:rFonts w:cs="Arial"/>
-          <w:color w:val="0000FF"/>
-        </w:rPr>
-        <w:t xml:space="preserve">. </w:t>
-      </w:r>
-    </w:p>
-    <w:p>
-      <w:pPr>
-        <w:ind w:firstLine="0"/>
-        <w:rPr>
-          <w:rFonts w:cs="Arial"/>
-          <w:color w:val="0000FF"/>
-        </w:rPr>
-      </w:pPr>
-    </w:p>
-    <w:p>
-      <w:pPr>
-        <w:ind w:firstLine="0"/>
-        <w:rPr>
-          <w:rFonts w:cs="Arial"/>
-          <w:color w:val="0000FF"/>
-        </w:rPr>
-      </w:pPr>
-      <w:r>
-        <w:rPr>
-          <w:rFonts w:cs="Arial"/>
-          <w:color w:val="0000FF"/>
-        </w:rPr>
-        <w:t>Obs: Gráficos e imagens são tratados como “figura”</w:t>
-      </w:r>
-      <w:r>
-        <w:rPr>
-          <w:rFonts w:cs="Arial"/>
-          <w:color w:val="0000FF"/>
-        </w:rPr>
-        <w:t xml:space="preserve">. </w:t>
-      </w:r>
-    </w:p>
-    <w:p>
-      <w:pPr>
-        <w:ind w:firstLine="0"/>
-        <w:jc w:val="center"/>
+        <w:pStyle w:val="ndicedeilustraes"/>
+        <w:tabs>
+          <w:tab w:val="right" w:leader="dot" w:pos="9061"/>
+        </w:tabs>
+        <w:ind w:firstLine="0"/>
+        <w:rPr>
+          <w:rFonts w:asciiTheme="minorHAnsi" w:eastAsiaTheme="minorEastAsia" w:hAnsiTheme="minorHAnsi" w:cstheme="minorBidi"/>
+          <w:noProof/>
+          <w:kern w:val="2"/>
+          <w14:ligatures w14:val="standardContextual"/>
+        </w:rPr>
+      </w:pPr>
+      <w:r>
         <w:rPr>
           <w:rFonts w:cs="Arial"/>
           <w:b/>
           <w:bCs/>
           <w:color w:val="FF0000"/>
         </w:rPr>
-      </w:pPr>
+        <w:fldChar w:fldCharType="begin"/>
+      </w:r>
+      <w:r>
+        <w:rPr>
+          <w:rFonts w:cs="Arial"/>
+          <w:b/>
+          <w:bCs/>
+          <w:color w:val="FF0000"/>
+        </w:rPr>
+        <w:instrText xml:space="preserve"> TOC \h \z \c "Figura" </w:instrText>
+      </w:r>
+      <w:r>
+        <w:rPr>
+          <w:rFonts w:cs="Arial"/>
+          <w:b/>
+          <w:bCs/>
+          <w:color w:val="FF0000"/>
+        </w:rPr>
+        <w:fldChar w:fldCharType="separate"/>
+      </w:r>
+      <w:hyperlink w:anchor="_Toc229419437" w:history="1">
+        <w:r>
+          <w:rPr>
+            <w:rStyle w:val="Hyperlink"/>
+            <w:noProof/>
+          </w:rPr>
+          <w:t>Figura 1 – Diagrama de Casos de Uso</w:t>
+        </w:r>
+        <w:r>
+          <w:rPr>
+            <w:noProof/>
+            <w:webHidden/>
+          </w:rPr>
+          <w:tab/>
+        </w:r>
+        <w:r>
+          <w:rPr>
+            <w:noProof/>
+            <w:webHidden/>
+          </w:rPr>
+          <w:fldChar w:fldCharType="begin"/>
+        </w:r>
+        <w:r>
+          <w:rPr>
+            <w:noProof/>
+            <w:webHidden/>
+          </w:rPr>
+          <w:instrText xml:space="preserve"> PAGEREF _Toc229419437 \h </w:instrText>
+        </w:r>
+        <w:r>
+          <w:rPr>
+            <w:noProof/>
+            <w:webHidden/>
+          </w:rPr>
+        </w:r>
+        <w:r>
+          <w:rPr>
+            <w:noProof/>
+            <w:webHidden/>
+          </w:rPr>
+          <w:fldChar w:fldCharType="separate"/>
+        </w:r>
+        <w:r>
+          <w:rPr>
+            <w:noProof/>
+            <w:webHidden/>
+          </w:rPr>
+          <w:t>12</w:t>
+        </w:r>
+        <w:r>
+          <w:rPr>
+            <w:noProof/>
+            <w:webHidden/>
+          </w:rPr>
+          <w:fldChar w:fldCharType="end"/>
+        </w:r>
+      </w:hyperlink>
+    </w:p>
+    <w:p>
+      <w:pPr>
+        <w:ind w:firstLine="0"/>
+        <w:rPr>
+          <w:rFonts w:cs="Arial"/>
+          <w:b/>
+          <w:bCs/>
+          <w:color w:val="FF0000"/>
+        </w:rPr>
+      </w:pPr>
+      <w:r>
+        <w:rPr>
+          <w:rFonts w:cs="Arial"/>
+          <w:b/>
+          <w:bCs/>
+          <w:color w:val="FF0000"/>
+        </w:rPr>
+        <w:fldChar w:fldCharType="end"/>
+      </w:r>
     </w:p>
     <w:p>
       <w:pPr>
@@ -2130,7 +2173,13 @@
         <w:pStyle w:val="Ttulo2"/>
       </w:pPr>
       <w:r>
-        <w:t xml:space="preserve">1.1 </w:t>
+        <w:t>1.1</w:t>
+      </w:r>
+      <w:r>
+        <w:t>.</w:t>
+      </w:r>
+      <w:r>
+        <w:t xml:space="preserve"> </w:t>
       </w:r>
       <w:r>
         <w:t>Descrição</w:t>
@@ -2141,7 +2190,13 @@
         <w:pStyle w:val="Ttulo3"/>
       </w:pPr>
       <w:r>
-        <w:t xml:space="preserve">1.1.1 </w:t>
+        <w:t>1.1.1</w:t>
+      </w:r>
+      <w:r>
+        <w:t>.</w:t>
+      </w:r>
+      <w:r>
+        <w:t xml:space="preserve"> </w:t>
       </w:r>
       <w:r>
         <w:t>Definição</w:t>
@@ -2166,7 +2221,13 @@
         <w:pStyle w:val="Ttulo3"/>
       </w:pPr>
       <w:r>
-        <w:t xml:space="preserve">1.1.2 </w:t>
+        <w:t>1.1.2</w:t>
+      </w:r>
+      <w:r>
+        <w:t>.</w:t>
+      </w:r>
+      <w:r>
+        <w:t xml:space="preserve"> </w:t>
       </w:r>
       <w:r>
         <w:t>Objetivo Geral</w:t>
@@ -2191,7 +2252,13 @@
         <w:pStyle w:val="Ttulo3"/>
       </w:pPr>
       <w:r>
-        <w:t xml:space="preserve">1.1.3 </w:t>
+        <w:t>1.1.3</w:t>
+      </w:r>
+      <w:r>
+        <w:t>.</w:t>
+      </w:r>
+      <w:r>
+        <w:t xml:space="preserve"> </w:t>
       </w:r>
       <w:r>
         <w:t>Cliente</w:t>
@@ -2208,7 +2275,13 @@
         <w:pStyle w:val="Ttulo2"/>
       </w:pPr>
       <w:r>
-        <w:t xml:space="preserve">1.2 </w:t>
+        <w:t>1.2</w:t>
+      </w:r>
+      <w:r>
+        <w:t>.</w:t>
+      </w:r>
+      <w:r>
+        <w:t xml:space="preserve"> </w:t>
       </w:r>
       <w:r>
         <w:t>Justificativa</w:t>
@@ -2308,7 +2381,13 @@
         <w:pStyle w:val="Ttulo3"/>
       </w:pPr>
       <w:r>
-        <w:t xml:space="preserve">1.2.2 </w:t>
+        <w:t>1.2.2</w:t>
+      </w:r>
+      <w:r>
+        <w:t>.</w:t>
+      </w:r>
+      <w:r>
+        <w:t xml:space="preserve"> </w:t>
       </w:r>
       <w:r>
         <w:t>Necessidades</w:t>
@@ -2397,7 +2476,13 @@
         <w:pStyle w:val="Ttulo2"/>
       </w:pPr>
       <w:r>
-        <w:t xml:space="preserve">1.3 </w:t>
+        <w:t>1.3</w:t>
+      </w:r>
+      <w:r>
+        <w:t>.</w:t>
+      </w:r>
+      <w:r>
+        <w:t xml:space="preserve"> </w:t>
       </w:r>
       <w:r>
         <w:t>Objetivo Específico</w:t>
@@ -2424,7 +2509,15 @@
         </w:numPr>
       </w:pPr>
       <w:r>
-        <w:t>Controle de Jornada: Desenvolver um sistema de controle de plantão com registro de entrada (check-in) e saída (check-out), ligado ao gps, exclusivo para o perfil das cuidadoras.</w:t>
+        <w:t>Controle de Jornada: Desenvolver um sistema de controle de plantão com registro de entrada (check-in) e saída (</w:t>
+      </w:r>
+      <w:proofErr w:type="spellStart"/>
+      <w:r>
+        <w:t>check-out</w:t>
+      </w:r>
+      <w:proofErr w:type="spellEnd"/>
+      <w:r>
+        <w:t>), ligado ao gps, exclusivo para o perfil das cuidadoras.</w:t>
       </w:r>
     </w:p>
     <w:p>
@@ -2464,7 +2557,7 @@
       <w:bookmarkStart w:id="1" w:name="_Toc162896122"/>
       <w:r>
         <w:lastRenderedPageBreak/>
-        <w:t>3</w:t>
+        <w:t>2</w:t>
       </w:r>
       <w:r>
         <w:t>.</w:t>
@@ -2479,7 +2572,16 @@
         <w:pStyle w:val="Ttulo2"/>
       </w:pPr>
       <w:r>
-        <w:t>3.1 Minimundo</w:t>
+        <w:t>2</w:t>
+      </w:r>
+      <w:r>
+        <w:t>.1</w:t>
+      </w:r>
+      <w:r>
+        <w:t>.</w:t>
+      </w:r>
+      <w:r>
+        <w:t xml:space="preserve"> Minimundo</w:t>
       </w:r>
     </w:p>
     <w:p>
@@ -2525,7 +2627,16 @@
       </w:pPr>
       <w:r>
         <w:lastRenderedPageBreak/>
-        <w:t>3.2 Regras de Negócio</w:t>
+        <w:t>2</w:t>
+      </w:r>
+      <w:r>
+        <w:t>.2</w:t>
+      </w:r>
+      <w:r>
+        <w:t>.</w:t>
+      </w:r>
+      <w:r>
+        <w:t xml:space="preserve"> Regras de Negócio</w:t>
       </w:r>
     </w:p>
     <w:p>
@@ -2912,7 +3023,16 @@
         <w:pStyle w:val="Ttulo2"/>
       </w:pPr>
       <w:r>
-        <w:t>3.3 Requisitos Funcionais</w:t>
+        <w:t>2</w:t>
+      </w:r>
+      <w:r>
+        <w:t>.3</w:t>
+      </w:r>
+      <w:r>
+        <w:t>.</w:t>
+      </w:r>
+      <w:r>
+        <w:t xml:space="preserve"> Requisitos Funcionais</w:t>
       </w:r>
     </w:p>
     <w:p>
@@ -3689,7 +3809,21 @@
               <w:rPr>
                 <w:rFonts w:cs="Arial"/>
               </w:rPr>
-              <w:t>O sistema deve registrar os horários de entrada (check-in) e saída (check-out) integrados à localização via GPS</w:t>
+              <w:t>O sistema deve registrar os horários de entrada (check-in) e saída (</w:t>
+            </w:r>
+            <w:proofErr w:type="spellStart"/>
+            <w:r>
+              <w:rPr>
+                <w:rFonts w:cs="Arial"/>
+              </w:rPr>
+              <w:t>check-out</w:t>
+            </w:r>
+            <w:proofErr w:type="spellEnd"/>
+            <w:r>
+              <w:rPr>
+                <w:rFonts w:cs="Arial"/>
+              </w:rPr>
+              <w:t>) integrados à localização via GPS</w:t>
             </w:r>
             <w:r>
               <w:rPr>
@@ -3933,12 +4067,28 @@
                 <w:rFonts w:cs="Arial"/>
               </w:rPr>
             </w:pPr>
-            <w:r>
-              <w:rPr>
-                <w:rFonts w:cs="Arial"/>
-              </w:rPr>
-              <w:t>Check-out Automático</w:t>
-            </w:r>
+            <w:proofErr w:type="spellStart"/>
+            <w:r>
+              <w:rPr>
+                <w:rFonts w:cs="Arial"/>
+              </w:rPr>
+              <w:t>Check-</w:t>
+            </w:r>
+            <w:proofErr w:type="gramStart"/>
+            <w:r>
+              <w:rPr>
+                <w:rFonts w:cs="Arial"/>
+              </w:rPr>
+              <w:t>out</w:t>
+            </w:r>
+            <w:proofErr w:type="spellEnd"/>
+            <w:r>
+              <w:rPr>
+                <w:rFonts w:cs="Arial"/>
+              </w:rPr>
+              <w:t xml:space="preserve"> Automático</w:t>
+            </w:r>
+            <w:proofErr w:type="gramEnd"/>
           </w:p>
         </w:tc>
         <w:tc>
@@ -4248,7 +4398,21 @@
                 <w:rFonts w:cs="Arial"/>
               </w:rPr>
               <w:lastRenderedPageBreak/>
-              <w:t>com base nos registros de check-in e check-out, para fins de pagamento.</w:t>
+              <w:t xml:space="preserve">com base nos registros de check-in e </w:t>
+            </w:r>
+            <w:proofErr w:type="spellStart"/>
+            <w:r>
+              <w:rPr>
+                <w:rFonts w:cs="Arial"/>
+              </w:rPr>
+              <w:t>check-out</w:t>
+            </w:r>
+            <w:proofErr w:type="spellEnd"/>
+            <w:r>
+              <w:rPr>
+                <w:rFonts w:cs="Arial"/>
+              </w:rPr>
+              <w:t>, para fins de pagamento.</w:t>
             </w:r>
           </w:p>
         </w:tc>
@@ -4469,7 +4633,16 @@
         <w:pStyle w:val="Ttulo2"/>
       </w:pPr>
       <w:r>
-        <w:t>3.3 Requisitos Não Funcionais</w:t>
+        <w:t>2</w:t>
+      </w:r>
+      <w:r>
+        <w:t>.3</w:t>
+      </w:r>
+      <w:r>
+        <w:t>.</w:t>
+      </w:r>
+      <w:r>
+        <w:t xml:space="preserve"> Requisitos Não Funcionais</w:t>
       </w:r>
     </w:p>
     <w:p>
@@ -4763,33 +4936,190 @@
           <w:rFonts w:cs="Arial"/>
         </w:rPr>
       </w:pPr>
-      <w:r>
-        <w:rPr>
-          <w:rFonts w:cs="Arial"/>
-        </w:rPr>
-        <w:t>D</w:t>
-      </w:r>
-      <w:r>
-        <w:rPr>
-          <w:rFonts w:cs="Arial"/>
-        </w:rPr>
-        <w:t>ER</w:t>
-      </w:r>
-    </w:p>
-    <w:p>
-      <w:pPr>
-        <w:ind w:firstLine="0"/>
-        <w:rPr>
-          <w:rFonts w:cs="Arial"/>
-        </w:rPr>
-      </w:pPr>
-      <w:r>
-        <w:rPr>
-          <w:rFonts w:cs="Arial"/>
-        </w:rPr>
+    </w:p>
+    <w:p>
+      <w:pPr>
+        <w:pStyle w:val="Ttulo2"/>
+      </w:pPr>
+      <w:r>
         <w:lastRenderedPageBreak/>
-        <w:t>DCU</w:t>
-      </w:r>
+        <w:t>2.4. Diagrama de Casos de Uso</w:t>
+      </w:r>
+    </w:p>
+    <w:p>
+      <w:pPr>
+        <w:ind w:firstLine="0"/>
+        <w:rPr>
+          <w:rFonts w:cs="Arial"/>
+        </w:rPr>
+      </w:pPr>
+    </w:p>
+    <w:p>
+      <w:pPr>
+        <w:pStyle w:val="Legenda"/>
+        <w:keepNext/>
+        <w:jc w:val="center"/>
+      </w:pPr>
+      <w:r>
+        <w:t xml:space="preserve">Figura </w:t>
+      </w:r>
+      <w:fldSimple w:instr=" SEQ Figura \* ARABIC ">
+        <w:r>
+          <w:rPr>
+            <w:noProof/>
+          </w:rPr>
+          <w:t>1</w:t>
+        </w:r>
+      </w:fldSimple>
+      <w:r>
+        <w:t xml:space="preserve"> </w:t>
+      </w:r>
+      <w:r>
+        <w:t>– Diagrama de Casos de Uso</w:t>
+      </w:r>
+    </w:p>
+    <w:p>
+      <w:pPr>
+        <w:keepNext/>
+        <w:ind w:firstLine="0"/>
+      </w:pPr>
+      <w:r>
+        <w:rPr>
+          <w:rFonts w:cs="Arial"/>
+          <w:noProof/>
+        </w:rPr>
+        <w:drawing>
+          <wp:inline distT="0" distB="0" distL="0" distR="0" wp14:anchorId="760C6694" wp14:editId="1B5A71E7">
+            <wp:extent cx="5759450" cy="4490085"/>
+            <wp:effectExtent l="0" t="0" r="0" b="5715"/>
+            <wp:docPr id="96992673" name="Imagem 1"/>
+            <wp:cNvGraphicFramePr>
+              <a:graphicFrameLocks xmlns:a="http://schemas.openxmlformats.org/drawingml/2006/main" noChangeAspect="1"/>
+            </wp:cNvGraphicFramePr>
+            <a:graphic xmlns:a="http://schemas.openxmlformats.org/drawingml/2006/main">
+              <a:graphicData uri="http://schemas.openxmlformats.org/drawingml/2006/picture">
+                <pic:pic xmlns:pic="http://schemas.openxmlformats.org/drawingml/2006/picture">
+                  <pic:nvPicPr>
+                    <pic:cNvPr id="0" name="Picture 1"/>
+                    <pic:cNvPicPr>
+                      <a:picLocks noChangeAspect="1" noChangeArrowheads="1"/>
+                    </pic:cNvPicPr>
+                  </pic:nvPicPr>
+                  <pic:blipFill>
+                    <a:blip r:embed="rId12">
+                      <a:extLst>
+                        <a:ext uri="{28A0092B-C50C-407E-A947-70E740481C1C}">
+                          <a14:useLocalDpi xmlns:a14="http://schemas.microsoft.com/office/drawing/2010/main" val="0"/>
+                        </a:ext>
+                      </a:extLst>
+                    </a:blip>
+                    <a:srcRect/>
+                    <a:stretch>
+                      <a:fillRect/>
+                    </a:stretch>
+                  </pic:blipFill>
+                  <pic:spPr bwMode="auto">
+                    <a:xfrm>
+                      <a:off x="0" y="0"/>
+                      <a:ext cx="5759450" cy="4490085"/>
+                    </a:xfrm>
+                    <a:prstGeom prst="rect">
+                      <a:avLst/>
+                    </a:prstGeom>
+                    <a:noFill/>
+                    <a:ln>
+                      <a:noFill/>
+                    </a:ln>
+                  </pic:spPr>
+                </pic:pic>
+              </a:graphicData>
+            </a:graphic>
+          </wp:inline>
+        </w:drawing>
+      </w:r>
+    </w:p>
+    <w:p>
+      <w:pPr>
+        <w:ind w:firstLine="0"/>
+        <w:jc w:val="center"/>
+        <w:rPr>
+          <w:rFonts w:cs="Arial"/>
+          <w:sz w:val="20"/>
+          <w:szCs w:val="20"/>
+        </w:rPr>
+      </w:pPr>
+      <w:r>
+        <w:rPr>
+          <w:rFonts w:cs="Arial"/>
+          <w:sz w:val="20"/>
+          <w:szCs w:val="20"/>
+        </w:rPr>
+        <w:t>Fonte: Autoria Própria</w:t>
+      </w:r>
+    </w:p>
+    <w:p>
+      <w:pPr>
+        <w:ind w:firstLine="0"/>
+        <w:rPr>
+          <w:rFonts w:cs="Arial"/>
+        </w:rPr>
+      </w:pPr>
+    </w:p>
+    <w:p>
+      <w:pPr>
+        <w:pStyle w:val="Ttulo2"/>
+      </w:pPr>
+      <w:r>
+        <w:t>2.5. Diagrama de Entidade e Relacionamento</w:t>
+      </w:r>
+    </w:p>
+    <w:p>
+      <w:pPr>
+        <w:ind w:firstLine="0"/>
+        <w:rPr>
+          <w:rFonts w:cs="Arial"/>
+        </w:rPr>
+      </w:pPr>
+    </w:p>
+    <w:p>
+      <w:pPr>
+        <w:ind w:firstLine="0"/>
+        <w:rPr>
+          <w:rFonts w:cs="Arial"/>
+        </w:rPr>
+      </w:pPr>
+    </w:p>
+    <w:p>
+      <w:pPr>
+        <w:pStyle w:val="Ttulo2"/>
+      </w:pPr>
+      <w:r>
+        <w:t>2.6. Diagrama de Atividade</w:t>
+      </w:r>
+    </w:p>
+    <w:p>
+      <w:pPr>
+        <w:ind w:firstLine="0"/>
+        <w:rPr>
+          <w:rFonts w:cs="Arial"/>
+        </w:rPr>
+      </w:pPr>
+    </w:p>
+    <w:p>
+      <w:pPr>
+        <w:ind w:firstLine="0"/>
+        <w:rPr>
+          <w:rFonts w:cs="Arial"/>
+        </w:rPr>
+      </w:pPr>
+    </w:p>
+    <w:p>
+      <w:pPr>
+        <w:ind w:firstLine="0"/>
+        <w:rPr>
+          <w:rFonts w:cs="Arial"/>
+        </w:rPr>
+      </w:pPr>
     </w:p>
     <w:p>
       <w:pPr>
@@ -4824,6 +5154,7 @@
         <w:rPr>
           <w:rFonts w:cs="Arial"/>
         </w:rPr>
+        <w:lastRenderedPageBreak/>
         <w:t>Fluxo de página</w:t>
       </w:r>
     </w:p>
@@ -4834,12 +5165,14 @@
           <w:rFonts w:cs="Arial"/>
         </w:rPr>
       </w:pPr>
+      <w:proofErr w:type="spellStart"/>
       <w:r>
         <w:rPr>
           <w:rFonts w:cs="Arial"/>
         </w:rPr>
         <w:t>Wireframe</w:t>
       </w:r>
+      <w:proofErr w:type="spellEnd"/>
     </w:p>
     <w:p>
       <w:pPr>
@@ -5014,7 +5347,23 @@
           <w:rFonts w:cs="Arial"/>
           <w:color w:val="FF0000"/>
         </w:rPr>
-        <w:t>O texto do trabalho deve ser escrito em estilo Normal. Usar espaçamento 1,5 entre as linhas e 0 pts entre os parágrafos.</w:t>
+        <w:t xml:space="preserve">O texto do trabalho deve ser escrito em estilo Normal. Usar espaçamento 1,5 entre as linhas e 0 </w:t>
+      </w:r>
+      <w:proofErr w:type="spellStart"/>
+      <w:r>
+        <w:rPr>
+          <w:rFonts w:cs="Arial"/>
+          <w:color w:val="FF0000"/>
+        </w:rPr>
+        <w:t>pts</w:t>
+      </w:r>
+      <w:proofErr w:type="spellEnd"/>
+      <w:r>
+        <w:rPr>
+          <w:rFonts w:cs="Arial"/>
+          <w:color w:val="FF0000"/>
+        </w:rPr>
+        <w:t xml:space="preserve"> entre os parágrafos.</w:t>
       </w:r>
     </w:p>
     <w:p>
@@ -5240,8 +5589,8 @@
       </w:pPr>
     </w:p>
     <w:sectPr>
-      <w:headerReference w:type="even" r:id="rId12"/>
-      <w:headerReference w:type="default" r:id="rId13"/>
+      <w:headerReference w:type="even" r:id="rId13"/>
+      <w:headerReference w:type="default" r:id="rId14"/>
       <w:pgSz w:w="11906" w:h="16838" w:code="9"/>
       <w:pgMar w:top="1701" w:right="1134" w:bottom="1134" w:left="1701" w:header="709" w:footer="709" w:gutter="0"/>
       <w:cols w:space="708"/>
@@ -5364,7 +5713,7 @@
           <w:noProof/>
         </w:rPr>
         <w:pict w14:anchorId="5A1BC969">
-          <v:rect id="_x0000_s1025" alt="" style="position:absolute;left:0;text-align:left;margin-left:0;margin-top:0;width:595.3pt;height:841.9pt;z-index:251658240;mso-wrap-edited:f;mso-width-percent:1000;mso-height-percent:1000;mso-position-horizontal-relative:page;mso-position-vertical-relative:page;mso-width-percent:1000;mso-height-percent:1000;mso-width-relative:page;mso-height-relative:page" o:bwmode="white" filled="f" stroked="f" strokeweight="0">
+          <v:rect id="_x0000_s1025" alt="" style="position:absolute;left:0;text-align:left;margin-left:0;margin-top:0;width:595.3pt;height:841.9pt;z-index:251659264;mso-wrap-edited:f;mso-width-percent:1000;mso-height-percent:1000;mso-position-horizontal-relative:page;mso-position-vertical-relative:page;mso-width-percent:1000;mso-height-percent:1000;mso-width-relative:page;mso-height-relative:page" o:bwmode="white" filled="f" stroked="f" strokeweight="0">
             <w10:wrap anchorx="margin" anchory="margin"/>
           </v:rect>
         </w:pict>
@@ -6113,7 +6462,7 @@
   <w:style w:type="paragraph" w:default="1" w:styleId="Normal">
     <w:name w:val="Normal"/>
     <w:qFormat/>
-    <w:rsid w:val="002666C6"/>
+    <w:rsid w:val="00875146"/>
     <w:pPr>
       <w:spacing w:line="360" w:lineRule="auto"/>
       <w:ind w:firstLine="709"/>

</xml_diff>

<commit_message>
Ajustes Diagramas e Minimundo
</commit_message>
<xml_diff>
--- a/Documentação/A4 Lab. Desenv. Web - FAC.docx
+++ b/Documentação/A4 Lab. Desenv. Web - FAC.docx
@@ -307,14 +307,12 @@
           <w:sz w:val="28"/>
         </w:rPr>
       </w:pPr>
-      <w:proofErr w:type="spellStart"/>
       <w:r>
         <w:rPr>
           <w:sz w:val="28"/>
         </w:rPr>
         <w:t>Fac</w:t>
       </w:r>
-      <w:proofErr w:type="spellEnd"/>
     </w:p>
     <w:p>
       <w:pPr>
@@ -637,14 +635,12 @@
           <w:sz w:val="28"/>
         </w:rPr>
       </w:pPr>
-      <w:proofErr w:type="spellStart"/>
       <w:r>
         <w:rPr>
           <w:sz w:val="28"/>
         </w:rPr>
         <w:t>Fac</w:t>
       </w:r>
-      <w:proofErr w:type="spellEnd"/>
     </w:p>
     <w:p>
       <w:pPr>
@@ -770,13 +766,8 @@
       <w:pPr>
         <w:pStyle w:val="NomedoOrientador"/>
       </w:pPr>
-      <w:proofErr w:type="spellStart"/>
-      <w:r>
-        <w:t>Co-orientador</w:t>
-      </w:r>
-      <w:proofErr w:type="spellEnd"/>
-      <w:r>
-        <w:t xml:space="preserve">: </w:t>
+      <w:r>
+        <w:t xml:space="preserve">Co-orientador: </w:t>
       </w:r>
       <w:r>
         <w:rPr>
@@ -794,16 +785,8 @@
         <w:rPr>
           <w:color w:val="FF0000"/>
         </w:rPr>
-        <w:t xml:space="preserve"> do </w:t>
-      </w:r>
-      <w:proofErr w:type="spellStart"/>
-      <w:r>
-        <w:rPr>
-          <w:color w:val="FF0000"/>
-        </w:rPr>
-        <w:t>co-orientador</w:t>
-      </w:r>
-      <w:proofErr w:type="spellEnd"/>
+        <w:t xml:space="preserve"> do co-orientador</w:t>
+      </w:r>
       <w:r>
         <w:rPr>
           <w:color w:val="FF0000"/>
@@ -2509,15 +2492,7 @@
         </w:numPr>
       </w:pPr>
       <w:r>
-        <w:t>Controle de Jornada: Desenvolver um sistema de controle de plantão com registro de entrada (check-in) e saída (</w:t>
-      </w:r>
-      <w:proofErr w:type="spellStart"/>
-      <w:r>
-        <w:t>check-out</w:t>
-      </w:r>
-      <w:proofErr w:type="spellEnd"/>
-      <w:r>
-        <w:t>), ligado ao gps, exclusivo para o perfil das cuidadoras.</w:t>
+        <w:t>Controle de Jornada: Desenvolver um sistema de controle de plantão com registro de entrada (check-in) e saída (check-out), ligado ao gps, exclusivo para o perfil das cuidadoras.</w:t>
       </w:r>
     </w:p>
     <w:p>
@@ -2594,24 +2569,54 @@
         <w:rPr>
           <w:rFonts w:cs="Arial"/>
         </w:rPr>
-        <w:t>A rotina de uma família que possui um ente querido idoso e debilitado exige acompanhamento constante, organização e comunicação eficiente. Para garantir o bem-estar e a segurança da paciente nas atividades diárias, a família atua como a gestora do cuidado e conta com o apoio de profissionais contratadas. Atualmente, duas cuidadoras se revezam no atendimento, operando inicialmente em uma escala de plantões de 48 por 48 horas. No entanto, essa jornada é flexível e frequentemente sofre alterações de acordo com a necessidade da família ou imprevistos, resultando em turnos de durações variadas, o que torna o controle de horas trabalhadas e a prestação de contas um grande desafio. A gestão dessa rotina operacional e clínica é feita de maneira totalmente informal. As cuidadoras utilizam aplicativos de mensagens instantâneas para avisar os familiares sobre o horário em que assumem o plantão, o momento exato da troca de turno com a outra profissional e a finalização da jornada. Esse mesmo canal improvisado é utilizado como um "prontuário não oficial" para relatar intercorrências, alterações no estado de saúde, recusas de alimentação ou eventos atípicos. Essa descentralização das informações gera um histórico fragmentado, dificultando a passagem de plantão entre as cuidadoras e impedindo que a família tenha uma visão clara e consolidada da evolução da paciente ao longo dos dias. Além da rotina domiciliar, o quadro de saúde da idosa exige um acompanhamento médico contínuo, envolvendo uma rede de diferentes especialistas e a realização de exames periódicos. O controle dessa agenda é feito de forma manual em calendários físicos ou anotações avulsas que não são compartilhadas entre todos os envolvidos no cuidado. Essa prática resulta em falhas críticas, como o esquecimento de datas de consultas importantes e a perda de informações essenciais, como o endereço da clínica, a especialidade de urgência ou o contato do médico responsável.</w:t>
-      </w:r>
-    </w:p>
-    <w:p>
-      <w:pPr>
-        <w:ind w:firstLine="0"/>
-        <w:rPr>
-          <w:rFonts w:cs="Arial"/>
-        </w:rPr>
-      </w:pPr>
-    </w:p>
-    <w:p>
-      <w:pPr>
-        <w:ind w:firstLine="0"/>
-        <w:rPr>
-          <w:rFonts w:cs="Arial"/>
-        </w:rPr>
-      </w:pPr>
+        <w:t>A rotina de uma família que possui um ente querido idoso e debilitado exige acompanhamento constante, organização e comunicação eficiente. Para garantir o bem-estar e a segurança da paciente nas atividades diárias, a família atua como a gestora do cuidado e conta com o apoio de profissionais contratadas. Atualmente, duas cuidadoras se revezam no atendimento, operando inicialmente em uma escala de plantões de 48 por 48 horas. No entanto, essa jornada é flexível e frequentemente sofre alterações de acordo com a necessidade da família ou imprevistos, resultando em turnos de durações variadas, o que torna o controle de horas trabalhadas e a prestação de contas um grande desafio.</w:t>
+      </w:r>
+    </w:p>
+    <w:p>
+      <w:pPr>
+        <w:rPr>
+          <w:rFonts w:cs="Arial"/>
+        </w:rPr>
+      </w:pPr>
+      <w:r>
+        <w:rPr>
+          <w:rFonts w:cs="Arial"/>
+        </w:rPr>
+        <w:t>A gestão dessa rotina operacional e clínica é feita de maneira totalmente informal. As cuidadoras utilizam aplicativos de mensagens instantâneas para avisar os familiares sobre o horário em que assumem o plantão, o momento exato da troca de turno com a outra profissional e a finalização da jornada. Esse mesmo canal improvisado é utilizado como um "prontuário não oficial" para relatar intercorrências, alterações no estado de saúde, recusas de alimentação ou eventos atípicos. Essa descentralização das informações gera um histórico fragmentado, dificultando a passagem de plantão entre as cuidadoras e impedindo que a família tenha uma visão clara e consolidada da evolução da paciente ao longo dos dias.</w:t>
+      </w:r>
+    </w:p>
+    <w:p>
+      <w:pPr>
+        <w:rPr>
+          <w:rFonts w:cs="Arial"/>
+        </w:rPr>
+      </w:pPr>
+      <w:r>
+        <w:rPr>
+          <w:rFonts w:cs="Arial"/>
+        </w:rPr>
+        <w:t>Além da rotina domiciliar, o quadro de saúde da idosa exige um acompanhamento médico contínuo, envolvendo uma rede de diferentes especialistas e a realização de exames periódicos. O controle dessa agenda é feito de forma manual em calendários físicos ou anotações avulsas que não são compartilhadas entre todos os envolvidos no cuidado. Essa prática resulta em falhas críticas, como o esquecimento de datas de consultas importantes e a perda de informações essenciais, como o endereço da clínica, a especialidade de urgência ou o contato do médico responsável.</w:t>
+      </w:r>
+    </w:p>
+    <w:p>
+      <w:pPr>
+        <w:rPr>
+          <w:rFonts w:cs="Arial"/>
+        </w:rPr>
+      </w:pPr>
+      <w:r>
+        <w:rPr>
+          <w:rFonts w:cs="Arial"/>
+        </w:rPr>
+        <w:t xml:space="preserve">Para utilizar o sistema, todos os participantes — sejam familiares ou cuidadores — devem realizar previamente seu próprio cadastro na plataforma, informando nome, e-mail e senha. O cadastro é individual e de responsabilidade de cada usuário. A criação de um paciente é realizada pelo familiar titular, que passa a ser o responsável </w:t>
+      </w:r>
+      <w:r>
+        <w:rPr>
+          <w:rFonts w:cs="Arial"/>
+        </w:rPr>
+        <w:lastRenderedPageBreak/>
+        <w:t>principal pelo gerenciamento daquele perfil. Para ampliar o círculo de cuidado, o familiar titular pode convidar outros familiares e cuidadores a participarem do acompanhamento de um paciente. Para isso, busca o usuário pelo e-mail previamente cadastrado na plataforma. Caso o e-mail seja encontrado, o sistema envia um convite de participação ao usuário localizado. O acesso ao paciente só é concedido após o convidado aceitar o convite recebido; caso o convite seja recusado ou ignorado, nenhum vínculo é criado e o convidado não passa a ter qualquer acesso ao perfil do paciente. Um familiar convidado, após aceitar, passa a ter acesso de leitura ao histórico, prontuário e agenda do paciente. Um cuidador convidado, após aceitar, passa a poder registrar ponto, abrir plantões e registrar ocorrências no diário referentes àquele paciente.</w:t>
+      </w:r>
     </w:p>
     <w:p>
       <w:pPr>
@@ -2626,7 +2631,6 @@
         <w:pStyle w:val="Ttulo2"/>
       </w:pPr>
       <w:r>
-        <w:lastRenderedPageBreak/>
         <w:t>2</w:t>
       </w:r>
       <w:r>
@@ -3194,6 +3198,7 @@
               <w:rPr>
                 <w:rFonts w:cs="Arial"/>
               </w:rPr>
+              <w:lastRenderedPageBreak/>
               <w:t>RF01</w:t>
             </w:r>
           </w:p>
@@ -3388,27 +3393,19 @@
               <w:rPr>
                 <w:rFonts w:cs="Arial"/>
               </w:rPr>
-              <w:t xml:space="preserve"> e cadastro </w:t>
-            </w:r>
-            <w:r>
-              <w:rPr>
-                <w:rFonts w:cs="Arial"/>
-              </w:rPr>
-              <w:t xml:space="preserve">(inclusão, alteração, exclusão e </w:t>
-            </w:r>
-          </w:p>
-          <w:p>
-            <w:pPr>
-              <w:ind w:firstLine="0"/>
-              <w:rPr>
-                <w:rFonts w:cs="Arial"/>
-              </w:rPr>
-            </w:pPr>
-            <w:r>
-              <w:rPr>
-                <w:rFonts w:cs="Arial"/>
-              </w:rPr>
-              <w:t>consulta) dos perfis dos familiares responsáveis pelo gerenciamento do cuidado.</w:t>
+              <w:t xml:space="preserve"> (Adicionar ou Remover) </w:t>
+            </w:r>
+            <w:r>
+              <w:rPr>
+                <w:rFonts w:cs="Arial"/>
+              </w:rPr>
+              <w:t>dos perfis familiares responsáveis pelo gerenciamento do cuidado.</w:t>
+            </w:r>
+            <w:r>
+              <w:rPr>
+                <w:rFonts w:cs="Arial"/>
+              </w:rPr>
+              <w:t xml:space="preserve"> Enviando convite para participar como membro familiar do paciente (Adicionar).</w:t>
             </w:r>
           </w:p>
         </w:tc>
@@ -3608,7 +3605,7 @@
               <w:rPr>
                 <w:rFonts w:cs="Arial"/>
               </w:rPr>
-              <w:t>O sistema deve permitir o cadastro</w:t>
+              <w:t>O sistema deve permitir a gestão (Adicionar ou Remover) dos perfis</w:t>
             </w:r>
             <w:r>
               <w:rPr>
@@ -3620,21 +3617,61 @@
               <w:rPr>
                 <w:rFonts w:cs="Arial"/>
               </w:rPr>
-              <w:t xml:space="preserve">(inclusão, alteração, exclusão e </w:t>
-            </w:r>
-          </w:p>
-          <w:p>
-            <w:pPr>
-              <w:ind w:firstLine="0"/>
-              <w:rPr>
-                <w:rFonts w:cs="Arial"/>
-              </w:rPr>
-            </w:pPr>
-            <w:r>
-              <w:rPr>
-                <w:rFonts w:cs="Arial"/>
-              </w:rPr>
-              <w:t>consulta) das cuidadoras.</w:t>
+              <w:t xml:space="preserve">de </w:t>
+            </w:r>
+            <w:r>
+              <w:rPr>
+                <w:rFonts w:cs="Arial"/>
+              </w:rPr>
+              <w:t>cuidador</w:t>
+            </w:r>
+            <w:r>
+              <w:rPr>
+                <w:rFonts w:cs="Arial"/>
+              </w:rPr>
+              <w:t xml:space="preserve"> </w:t>
+            </w:r>
+            <w:r>
+              <w:rPr>
+                <w:rFonts w:cs="Arial"/>
+              </w:rPr>
+              <w:t>d</w:t>
+            </w:r>
+            <w:r>
+              <w:rPr>
+                <w:rFonts w:cs="Arial"/>
+              </w:rPr>
+              <w:t>o paciente</w:t>
+            </w:r>
+            <w:r>
+              <w:rPr>
+                <w:rFonts w:cs="Arial"/>
+              </w:rPr>
+              <w:t>.</w:t>
+            </w:r>
+            <w:r>
+              <w:rPr>
+                <w:rFonts w:cs="Arial"/>
+              </w:rPr>
+              <w:t xml:space="preserve"> </w:t>
+            </w:r>
+            <w:r>
+              <w:rPr>
+                <w:rFonts w:cs="Arial"/>
+              </w:rPr>
+              <w:t xml:space="preserve">Enviando convite para participar como </w:t>
+            </w:r>
+            <w:r>
+              <w:rPr>
+                <w:rFonts w:cs="Arial"/>
+              </w:rPr>
+              <w:t xml:space="preserve">cuidador </w:t>
+            </w:r>
+            <w:r>
+              <w:rPr>
+                <w:rFonts w:cs="Arial"/>
+              </w:rPr>
+              <w:t>do paciente (Adicionar).</w:t>
             </w:r>
           </w:p>
         </w:tc>
@@ -3676,7 +3713,6 @@
               <w:rPr>
                 <w:rFonts w:cs="Arial"/>
               </w:rPr>
-              <w:lastRenderedPageBreak/>
               <w:t>RF0</w:t>
             </w:r>
             <w:r>
@@ -3809,21 +3845,7 @@
               <w:rPr>
                 <w:rFonts w:cs="Arial"/>
               </w:rPr>
-              <w:t>O sistema deve registrar os horários de entrada (check-in) e saída (</w:t>
-            </w:r>
-            <w:proofErr w:type="spellStart"/>
-            <w:r>
-              <w:rPr>
-                <w:rFonts w:cs="Arial"/>
-              </w:rPr>
-              <w:t>check-out</w:t>
-            </w:r>
-            <w:proofErr w:type="spellEnd"/>
-            <w:r>
-              <w:rPr>
-                <w:rFonts w:cs="Arial"/>
-              </w:rPr>
-              <w:t>) integrados à localização via GPS</w:t>
+              <w:t>O sistema deve registrar os horários de entrada (check-in) e saída (check-out) integrados à localização via GPS</w:t>
             </w:r>
             <w:r>
               <w:rPr>
@@ -4009,7 +4031,19 @@
               <w:rPr>
                 <w:rFonts w:cs="Arial"/>
               </w:rPr>
-              <w:t xml:space="preserve"> um cronograma preliminar de plantões na agenda, assegurando a atualização imediata dos registros caso ocorram alterações no início do turno, para manter a integridade dos dados.</w:t>
+              <w:t xml:space="preserve"> um cronograma preliminar de plantões na agenda, assegurando a atualização imediata dos registros caso ocorram alterações no </w:t>
+            </w:r>
+            <w:r>
+              <w:rPr>
+                <w:rFonts w:cs="Arial"/>
+              </w:rPr>
+              <w:t>plantão</w:t>
+            </w:r>
+            <w:r>
+              <w:rPr>
+                <w:rFonts w:cs="Arial"/>
+              </w:rPr>
+              <w:t>, para manter a integridade dos dados.</w:t>
             </w:r>
           </w:p>
         </w:tc>
@@ -4051,6 +4085,7 @@
               <w:rPr>
                 <w:rFonts w:cs="Arial"/>
               </w:rPr>
+              <w:lastRenderedPageBreak/>
               <w:t>RF09</w:t>
             </w:r>
           </w:p>
@@ -4067,28 +4102,12 @@
                 <w:rFonts w:cs="Arial"/>
               </w:rPr>
             </w:pPr>
-            <w:proofErr w:type="spellStart"/>
-            <w:r>
-              <w:rPr>
-                <w:rFonts w:cs="Arial"/>
-              </w:rPr>
-              <w:t>Check-</w:t>
-            </w:r>
-            <w:proofErr w:type="gramStart"/>
-            <w:r>
-              <w:rPr>
-                <w:rFonts w:cs="Arial"/>
-              </w:rPr>
-              <w:t>out</w:t>
-            </w:r>
-            <w:proofErr w:type="spellEnd"/>
-            <w:r>
-              <w:rPr>
-                <w:rFonts w:cs="Arial"/>
-              </w:rPr>
-              <w:t xml:space="preserve"> Automático</w:t>
-            </w:r>
-            <w:proofErr w:type="gramEnd"/>
+            <w:r>
+              <w:rPr>
+                <w:rFonts w:cs="Arial"/>
+              </w:rPr>
+              <w:t>Check-out Automático</w:t>
+            </w:r>
           </w:p>
         </w:tc>
         <w:tc>
@@ -4391,28 +4410,7 @@
               <w:rPr>
                 <w:rFonts w:cs="Arial"/>
               </w:rPr>
-              <w:t xml:space="preserve"> cuidador ao final do mês, </w:t>
-            </w:r>
-            <w:r>
-              <w:rPr>
-                <w:rFonts w:cs="Arial"/>
-              </w:rPr>
-              <w:lastRenderedPageBreak/>
-              <w:t xml:space="preserve">com base nos registros de check-in e </w:t>
-            </w:r>
-            <w:proofErr w:type="spellStart"/>
-            <w:r>
-              <w:rPr>
-                <w:rFonts w:cs="Arial"/>
-              </w:rPr>
-              <w:t>check-out</w:t>
-            </w:r>
-            <w:proofErr w:type="spellEnd"/>
-            <w:r>
-              <w:rPr>
-                <w:rFonts w:cs="Arial"/>
-              </w:rPr>
-              <w:t>, para fins de pagamento.</w:t>
+              <w:t xml:space="preserve"> cuidador ao final do mês, com base nos registros de check-in e check-out, para fins de pagamento.</w:t>
             </w:r>
           </w:p>
         </w:tc>
@@ -4432,7 +4430,6 @@
               <w:rPr>
                 <w:rFonts w:cs="Arial"/>
               </w:rPr>
-              <w:lastRenderedPageBreak/>
               <w:t>Sistema</w:t>
             </w:r>
           </w:p>
@@ -4749,6 +4746,7 @@
               <w:rPr>
                 <w:rFonts w:cs="Arial"/>
               </w:rPr>
+              <w:lastRenderedPageBreak/>
               <w:t>RNF01</w:t>
             </w:r>
           </w:p>
@@ -4942,7 +4940,6 @@
         <w:pStyle w:val="Ttulo2"/>
       </w:pPr>
       <w:r>
-        <w:lastRenderedPageBreak/>
         <w:t>2.4. Diagrama de Casos de Uso</w:t>
       </w:r>
     </w:p>
@@ -4961,6 +4958,7 @@
         <w:jc w:val="center"/>
       </w:pPr>
       <w:r>
+        <w:lastRenderedPageBreak/>
         <w:t xml:space="preserve">Figura </w:t>
       </w:r>
       <w:fldSimple w:instr=" SEQ Figura \* ARABIC ">
@@ -5154,37 +5152,35 @@
         <w:rPr>
           <w:rFonts w:cs="Arial"/>
         </w:rPr>
+        <w:t>Fluxo de página</w:t>
+      </w:r>
+    </w:p>
+    <w:p>
+      <w:pPr>
+        <w:ind w:firstLine="0"/>
+        <w:rPr>
+          <w:rFonts w:cs="Arial"/>
+        </w:rPr>
+      </w:pPr>
+      <w:r>
+        <w:rPr>
+          <w:rFonts w:cs="Arial"/>
+        </w:rPr>
+        <w:t>Wireframe</w:t>
+      </w:r>
+    </w:p>
+    <w:p>
+      <w:pPr>
+        <w:ind w:firstLine="0"/>
+        <w:rPr>
+          <w:rFonts w:cs="Arial"/>
+        </w:rPr>
+      </w:pPr>
+      <w:r>
+        <w:rPr>
+          <w:rFonts w:cs="Arial"/>
+        </w:rPr>
         <w:lastRenderedPageBreak/>
-        <w:t>Fluxo de página</w:t>
-      </w:r>
-    </w:p>
-    <w:p>
-      <w:pPr>
-        <w:ind w:firstLine="0"/>
-        <w:rPr>
-          <w:rFonts w:cs="Arial"/>
-        </w:rPr>
-      </w:pPr>
-      <w:proofErr w:type="spellStart"/>
-      <w:r>
-        <w:rPr>
-          <w:rFonts w:cs="Arial"/>
-        </w:rPr>
-        <w:t>Wireframe</w:t>
-      </w:r>
-      <w:proofErr w:type="spellEnd"/>
-    </w:p>
-    <w:p>
-      <w:pPr>
-        <w:ind w:firstLine="0"/>
-        <w:rPr>
-          <w:rFonts w:cs="Arial"/>
-        </w:rPr>
-      </w:pPr>
-      <w:r>
-        <w:rPr>
-          <w:rFonts w:cs="Arial"/>
-        </w:rPr>
         <w:t>Desing</w:t>
       </w:r>
     </w:p>
@@ -5347,23 +5343,7 @@
           <w:rFonts w:cs="Arial"/>
           <w:color w:val="FF0000"/>
         </w:rPr>
-        <w:t xml:space="preserve">O texto do trabalho deve ser escrito em estilo Normal. Usar espaçamento 1,5 entre as linhas e 0 </w:t>
-      </w:r>
-      <w:proofErr w:type="spellStart"/>
-      <w:r>
-        <w:rPr>
-          <w:rFonts w:cs="Arial"/>
-          <w:color w:val="FF0000"/>
-        </w:rPr>
-        <w:t>pts</w:t>
-      </w:r>
-      <w:proofErr w:type="spellEnd"/>
-      <w:r>
-        <w:rPr>
-          <w:rFonts w:cs="Arial"/>
-          <w:color w:val="FF0000"/>
-        </w:rPr>
-        <w:t xml:space="preserve"> entre os parágrafos.</w:t>
+        <w:t>O texto do trabalho deve ser escrito em estilo Normal. Usar espaçamento 1,5 entre as linhas e 0 pts entre os parágrafos.</w:t>
       </w:r>
     </w:p>
     <w:p>
@@ -5713,7 +5693,7 @@
           <w:noProof/>
         </w:rPr>
         <w:pict w14:anchorId="5A1BC969">
-          <v:rect id="_x0000_s1025" alt="" style="position:absolute;left:0;text-align:left;margin-left:0;margin-top:0;width:595.3pt;height:841.9pt;z-index:251659264;mso-wrap-edited:f;mso-width-percent:1000;mso-height-percent:1000;mso-position-horizontal-relative:page;mso-position-vertical-relative:page;mso-width-percent:1000;mso-height-percent:1000;mso-width-relative:page;mso-height-relative:page" o:bwmode="white" filled="f" stroked="f" strokeweight="0">
+          <v:rect id="_x0000_s1025" alt="" style="position:absolute;left:0;text-align:left;margin-left:0;margin-top:0;width:595.3pt;height:841.9pt;z-index:251658240;mso-wrap-edited:f;mso-width-percent:1000;mso-height-percent:1000;mso-position-horizontal-relative:page;mso-position-vertical-relative:page;mso-width-percent:1000;mso-height-percent:1000;mso-width-relative:page;mso-height-relative:page" o:bwmode="white" filled="f" stroked="f" strokeweight="0">
             <w10:wrap anchorx="margin" anchory="margin"/>
           </v:rect>
         </w:pict>

</xml_diff>